<commit_message>
v140: §2.7 removed entirely — section heading and provision deleted; Inspectorate reporting function covered by Article VIII; §3.6 cross-reference updated to Article VIII; no authority matrix added (document provisions cover authority fully); annotated.html provision count updated; fresh v140 rebuild
</commit_message>
<xml_diff>
--- a/constitution-v139.docx
+++ b/constitution-v139.docx
@@ -317,32 +317,6 @@
     </w:p>
     <w:p>
       <w:pPr>
-        <w:spacing w:after="60" w:before="60" w:line="280" w:lineRule="auto"/>
-        <w:jc w:val="both"/>
-      </w:pPr>
-      <w:r>
-        <w:rPr>
-          <w:rFonts w:ascii="Times New Roman" w:cs="Times New Roman" w:eastAsia="Times New Roman" w:hAnsi="Times New Roman"/>
-          <w:b/>
-          <w:bCs/>
-          <w:color w:val="1B2A4A"/>
-          <w:sz w:val="22"/>
-          <w:szCs w:val="22"/>
-        </w:rPr>
-        <w:t xml:space="preserve">2.7 Constitutional Non-Compliance Reporting: </w:t>
-      </w:r>
-      <w:r>
-        <w:rPr>
-          <w:rFonts w:ascii="Times New Roman" w:cs="Times New Roman" w:eastAsia="Times New Roman" w:hAnsi="Times New Roman"/>
-          <w:color w:val="000000"/>
-          <w:sz w:val="22"/>
-          <w:szCs w:val="22"/>
-        </w:rPr>
-        <w:t xml:space="preserve">The Inspectorates publish findings of constitutional non-compliance to the National Record System. These findings are factually grounded, publicly accessible, and do not constitute legal determinations — only courts may make legal conclusions from Inspectorate findings. Constitutional violations are addressed through the ordinary courts and through the political accountability mechanisms established by this Constitution: elections, recall, the constructive no-confidence mechanism, chamber expulsion under §3.6, and criminal prosecution where conduct is criminal. No automatic consequence flows from an Inspectorate finding. The permanent public record on the National Record System is the primary accountability instrument.</w:t>
-      </w:r>
-    </w:p>
-    <w:p>
-      <w:pPr>
         <w:pBdr>
           <w:bottom w:val="single" w:color="7A7060" w:sz="2" w:space="4"/>
         </w:pBdr>
@@ -3064,25 +3038,6 @@
           <w:sz w:val="23"/>
           <w:szCs w:val="23"/>
         </w:rPr>
-        <w:t xml:space="preserve">Section 2.7 — Constitutional Violations and Automatic Consequences</w:t>
-      </w:r>
-    </w:p>
-    <w:p>
-      <w:pPr>
-        <w:pBdr>
-          <w:bottom w:val="single" w:color="7A7060" w:sz="2" w:space="4"/>
-        </w:pBdr>
-        <w:spacing w:after="60" w:before="280"/>
-      </w:pPr>
-      <w:r>
-        <w:rPr>
-          <w:rFonts w:ascii="Times New Roman" w:cs="Times New Roman" w:eastAsia="Times New Roman" w:hAnsi="Times New Roman"/>
-          <w:b/>
-          <w:bCs/>
-          <w:color w:val="1B2A4A"/>
-          <w:sz w:val="23"/>
-          <w:szCs w:val="23"/>
-        </w:rPr>
         <w:t xml:space="preserve">Section 2.8 — Emergency Governance Protocol</w:t>
       </w:r>
     </w:p>
@@ -4263,7 +4218,7 @@
           <w:sz w:val="22"/>
           <w:szCs w:val="22"/>
         </w:rPr>
-        <w:t xml:space="preserve">This section governs the political impeachment track — initiated by the House and distinct from the Inspectorate reporting and political accountability mechanisms. This section applies exclusively to executive and judicial officers of the Republic. Legislative members of the House and Senate are not subject to this section — their removal is governed exclusively by §3.6 as the specific provision for legislative self-governance, and by the Inspectorate reporting provisions of §2.7.</w:t>
+        <w:t>This section governs the political impeachment track — initiated by the House and distinct from the Inspectorate reporting and political accountability mechanisms. This section applies exclusively to executive and judicial officers of the Republic. Legislative members of the House and Senate are not subject to this section — their removal is governed exclusively by §3.6 as the specific provision for legislative self-governance, and by the Inspectorate reporting provisions of Article VIII.</w:t>
       </w:r>
     </w:p>
     <w:p>

</xml_diff>